<commit_message>
Dodaj odpowiedzi ze strony 1 do warsztatu 1
Co-Authored-By: Claude Opus 5.5 <noreply@anthropic.com>
Claude-Session: https://claude.ai/code/session_01W1W5NhLXtv7c8YtsJMjuj5
</commit_message>
<xml_diff>
--- a/warsztat_1/warsztat_1_odpowiedzi.docx
+++ b/warsztat_1/warsztat_1_odpowiedzi.docx
@@ -16,6 +16,145 @@
           <w:szCs w:val="28"/>
         </w:rPr>
         <w:t xml:space="preserve">Ćwiczenie 1 – filtrowanie danych</w:t>
+      </w:r>
+    </w:p>
+    <w:p>
+      <w:pPr>
+        <w:keepNext/>
+        <w:spacing w:after="120" w:before="240"/>
+      </w:pPr>
+      <w:r>
+        <w:rPr>
+          <w:rFonts w:ascii="Calibri" w:cs="Calibri" w:eastAsia="Calibri" w:hAnsi="Calibri"/>
+          <w:b/>
+          <w:bCs/>
+          <w:sz w:val="24"/>
+          <w:szCs w:val="24"/>
+        </w:rPr>
+        <w:t xml:space="preserve">Pytania biznesowe przed analizą</w:t>
+      </w:r>
+    </w:p>
+    <w:p>
+      <w:pPr>
+        <w:pStyle w:val="ListParagraph"/>
+        <w:numPr>
+          <w:ilvl w:val="0"/>
+          <w:numId w:val="2"/>
+        </w:numPr>
+        <w:spacing w:after="40"/>
+      </w:pPr>
+      <w:r>
+        <w:rPr>
+          <w:rFonts w:ascii="Calibri" w:cs="Calibri" w:eastAsia="Calibri" w:hAnsi="Calibri"/>
+        </w:rPr>
+        <w:t xml:space="preserve">Które źródło ruchu przynosi najwięcej zakupów?</w:t>
+      </w:r>
+    </w:p>
+    <w:p>
+      <w:pPr>
+        <w:pStyle w:val="ListParagraph"/>
+        <w:numPr>
+          <w:ilvl w:val="0"/>
+          <w:numId w:val="2"/>
+        </w:numPr>
+        <w:spacing w:after="40"/>
+      </w:pPr>
+      <w:r>
+        <w:rPr>
+          <w:rFonts w:ascii="Calibri" w:cs="Calibri" w:eastAsia="Calibri" w:hAnsi="Calibri"/>
+        </w:rPr>
+        <w:t xml:space="preserve">Na jakim urządzeniu klienci kupują najczęściej, a na jakim najrzadziej?</w:t>
+      </w:r>
+    </w:p>
+    <w:p>
+      <w:pPr>
+        <w:pStyle w:val="ListParagraph"/>
+        <w:numPr>
+          <w:ilvl w:val="0"/>
+          <w:numId w:val="2"/>
+        </w:numPr>
+        <w:spacing w:after="40"/>
+      </w:pPr>
+      <w:r>
+        <w:rPr>
+          <w:rFonts w:ascii="Calibri" w:cs="Calibri" w:eastAsia="Calibri" w:hAnsi="Calibri"/>
+        </w:rPr>
+        <w:t xml:space="preserve">Z których krajów klienci kupują najwięcej?</w:t>
+      </w:r>
+    </w:p>
+    <w:p>
+      <w:pPr>
+        <w:pStyle w:val="ListParagraph"/>
+        <w:numPr>
+          <w:ilvl w:val="0"/>
+          <w:numId w:val="2"/>
+        </w:numPr>
+        <w:spacing w:after="40"/>
+      </w:pPr>
+      <w:r>
+        <w:rPr>
+          <w:rFonts w:ascii="Calibri" w:cs="Calibri" w:eastAsia="Calibri" w:hAnsi="Calibri"/>
+        </w:rPr>
+        <w:t xml:space="preserve">Czy nowi klienci kupują tak samo często jak powracający?</w:t>
+      </w:r>
+    </w:p>
+    <w:p>
+      <w:pPr>
+        <w:pStyle w:val="ListParagraph"/>
+        <w:numPr>
+          <w:ilvl w:val="0"/>
+          <w:numId w:val="2"/>
+        </w:numPr>
+        <w:spacing w:after="40"/>
+      </w:pPr>
+      <w:r>
+        <w:rPr>
+          <w:rFonts w:ascii="Calibri" w:cs="Calibri" w:eastAsia="Calibri" w:hAnsi="Calibri"/>
+        </w:rPr>
+        <w:t xml:space="preserve">Dlaczego część użytkowników od razu wychodzi ze strony?</w:t>
+      </w:r>
+    </w:p>
+    <w:p>
+      <w:pPr>
+        <w:pStyle w:val="ListParagraph"/>
+        <w:numPr>
+          <w:ilvl w:val="0"/>
+          <w:numId w:val="2"/>
+        </w:numPr>
+        <w:spacing w:after="40"/>
+      </w:pPr>
+      <w:r>
+        <w:rPr>
+          <w:rFonts w:ascii="Calibri" w:cs="Calibri" w:eastAsia="Calibri" w:hAnsi="Calibri"/>
+        </w:rPr>
+        <w:t xml:space="preserve">Ile kosztuje firmę pozyskanie jednego klienta z reklamy?</w:t>
+      </w:r>
+    </w:p>
+    <w:p>
+      <w:pPr>
+        <w:keepNext/>
+        <w:spacing w:after="120" w:before="240"/>
+      </w:pPr>
+      <w:r>
+        <w:rPr>
+          <w:rFonts w:ascii="Calibri" w:cs="Calibri" w:eastAsia="Calibri" w:hAnsi="Calibri"/>
+          <w:b/>
+          <w:bCs/>
+          <w:sz w:val="24"/>
+          <w:szCs w:val="24"/>
+        </w:rPr>
+        <w:t xml:space="preserve">KPI do oceny skuteczności działań</w:t>
+      </w:r>
+    </w:p>
+    <w:p>
+      <w:pPr>
+        <w:spacing w:after="100"/>
+      </w:pPr>
+      <w:r>
+        <w:rPr>
+          <w:rFonts w:ascii="Calibri" w:cs="Calibri" w:eastAsia="Calibri" w:hAnsi="Calibri"/>
+        </w:rPr>
+        <w:t xml:space="preserve">Wybralibyśmy współczynnik konwersji, średnią wartość koszyka i koszt pozyskania klienta (CAC). Konwersja pokazuje, czy rośnie liczba zakupów. Średni koszyk pokazuje, ile klienci wydają. CAC pokazuje, ile firma płaci za reklamę w przeliczeniu na jednego klienta, więc mówi, czy reklama się opłaca.</w:t>
       </w:r>
     </w:p>
     <w:p>

</xml_diff>